<commit_message>
Kartu nama pakai gambar logo langsung
</commit_message>
<xml_diff>
--- a/artikel/contoh tulisan logo.docx
+++ b/artikel/contoh tulisan logo.docx
@@ -12,20 +12,286 @@
           <w:bCs/>
           <w:szCs w:val="24"/>
         </w:rPr>
+      </w:pPr>
+    </w:p>
+    <w:p/>
+    <w:p/>
+    <w:p/>
+    <w:p>
+      <w:pPr>
+        <w:rPr>
+          <w:rFonts w:ascii="Times New Roman" w:eastAsia="Calibri" w:hAnsi="Times New Roman" w:cs="Times New Roman"/>
+          <w:bCs/>
+          <w:sz w:val="24"/>
+          <w:szCs w:val="24"/>
+        </w:rPr>
+      </w:pPr>
+    </w:p>
+    <w:p>
+      <w:pPr>
+        <w:pStyle w:val="Header"/>
+        <w:tabs>
+          <w:tab w:val="clear" w:pos="4680"/>
+        </w:tabs>
+        <w:spacing w:line="0" w:lineRule="atLeast"/>
+        <w:jc w:val="center"/>
+        <w:rPr>
+          <w:rFonts w:ascii="Vivaldi" w:hAnsi="Vivaldi" w:cstheme="majorBidi"/>
+          <w:b/>
+          <w:bCs/>
+          <w:color w:val="000000" w:themeColor="text1"/>
+          <w:sz w:val="32"/>
+          <w:szCs w:val="32"/>
+        </w:rPr>
+      </w:pPr>
+      <w:r>
+        <w:rPr>
+          <w:noProof/>
+          <w:color w:val="000000" w:themeColor="text1"/>
+          <w:sz w:val="24"/>
+          <w:szCs w:val="24"/>
+        </w:rPr>
+        <w:drawing>
+          <wp:anchor distT="0" distB="0" distL="114300" distR="114300" simplePos="0" relativeHeight="251659264" behindDoc="0" locked="0" layoutInCell="1" allowOverlap="1" wp14:anchorId="4E81A2AD" wp14:editId="5E4A9898">
+            <wp:simplePos x="0" y="0"/>
+            <wp:positionH relativeFrom="margin">
+              <wp:align>center</wp:align>
+            </wp:positionH>
+            <wp:positionV relativeFrom="paragraph">
+              <wp:posOffset>-190500</wp:posOffset>
+            </wp:positionV>
+            <wp:extent cx="1076325" cy="1030605"/>
+            <wp:effectExtent l="0" t="0" r="9525" b="0"/>
+            <wp:wrapTopAndBottom/>
+            <wp:docPr id="1" name="Picture 1"/>
+            <wp:cNvGraphicFramePr>
+              <a:graphicFrameLocks xmlns:a="http://schemas.openxmlformats.org/drawingml/2006/main" noChangeAspect="1"/>
+            </wp:cNvGraphicFramePr>
+            <a:graphic xmlns:a="http://schemas.openxmlformats.org/drawingml/2006/main">
+              <a:graphicData uri="http://schemas.openxmlformats.org/drawingml/2006/picture">
+                <pic:pic xmlns:pic="http://schemas.openxmlformats.org/drawingml/2006/picture">
+                  <pic:nvPicPr>
+                    <pic:cNvPr id="1" name="Picture 1"/>
+                    <pic:cNvPicPr/>
+                  </pic:nvPicPr>
+                  <pic:blipFill rotWithShape="1">
+                    <a:blip r:embed="rId7" cstate="print">
+                      <a:clrChange>
+                        <a:clrFrom>
+                          <a:srgbClr val="341D1A"/>
+                        </a:clrFrom>
+                        <a:clrTo>
+                          <a:srgbClr val="341D1A">
+                            <a:alpha val="0"/>
+                          </a:srgbClr>
+                        </a:clrTo>
+                      </a:clrChange>
+                      <a:alphaModFix/>
+                      <a:extLst>
+                        <a:ext uri="{BEBA8EAE-BF5A-486C-A8C5-ECC9F3942E4B}">
+                          <a14:imgProps xmlns:a14="http://schemas.microsoft.com/office/drawing/2010/main">
+                            <a14:imgLayer r:embed="rId8">
+                              <a14:imgEffect>
+                                <a14:brightnessContrast bright="20000"/>
+                              </a14:imgEffect>
+                            </a14:imgLayer>
+                          </a14:imgProps>
+                        </a:ext>
+                        <a:ext uri="{28A0092B-C50C-407E-A947-70E740481C1C}">
+                          <a14:useLocalDpi xmlns:a14="http://schemas.microsoft.com/office/drawing/2010/main" val="0"/>
+                        </a:ext>
+                      </a:extLst>
+                    </a:blip>
+                    <a:srcRect l="23077" t="15064" r="27564" b="37660"/>
+                    <a:stretch/>
+                  </pic:blipFill>
+                  <pic:spPr bwMode="auto">
+                    <a:xfrm>
+                      <a:off x="0" y="0"/>
+                      <a:ext cx="1076325" cy="1030605"/>
+                    </a:xfrm>
+                    <a:prstGeom prst="rect">
+                      <a:avLst/>
+                    </a:prstGeom>
+                    <a:ln>
+                      <a:noFill/>
+                    </a:ln>
+                    <a:extLst>
+                      <a:ext uri="{53640926-AAD7-44D8-BBD7-CCE9431645EC}">
+                        <a14:shadowObscured xmlns:a14="http://schemas.microsoft.com/office/drawing/2010/main"/>
+                      </a:ext>
+                    </a:extLst>
+                  </pic:spPr>
+                </pic:pic>
+              </a:graphicData>
+            </a:graphic>
+            <wp14:sizeRelH relativeFrom="margin">
+              <wp14:pctWidth>0</wp14:pctWidth>
+            </wp14:sizeRelH>
+            <wp14:sizeRelV relativeFrom="margin">
+              <wp14:pctHeight>0</wp14:pctHeight>
+            </wp14:sizeRelV>
+          </wp:anchor>
+        </w:drawing>
+      </w:r>
+      <w:proofErr w:type="spellStart"/>
+      <w:r>
+        <w:rPr>
+          <w:rFonts w:ascii="Vivaldi" w:hAnsi="Vivaldi" w:cstheme="majorBidi"/>
+          <w:b/>
+          <w:bCs/>
+          <w:color w:val="000000" w:themeColor="text1"/>
+          <w:sz w:val="32"/>
+          <w:szCs w:val="32"/>
+        </w:rPr>
+        <w:t>Mif</w:t>
+      </w:r>
+      <w:proofErr w:type="spellEnd"/>
+      <w:r>
+        <w:rPr>
+          <w:rFonts w:asciiTheme="majorBidi" w:hAnsiTheme="majorBidi" w:cstheme="majorBidi"/>
+          <w:b/>
+          <w:bCs/>
+          <w:color w:val="000000" w:themeColor="text1"/>
+          <w:sz w:val="32"/>
+          <w:szCs w:val="32"/>
+        </w:rPr>
+        <w:t xml:space="preserve"> </w:t>
+      </w:r>
+      <w:r>
+        <w:rPr>
+          <w:rFonts w:ascii="Vivaldi" w:hAnsi="Vivaldi" w:cstheme="majorBidi"/>
+          <w:b/>
+          <w:bCs/>
+          <w:color w:val="000000" w:themeColor="text1"/>
+          <w:sz w:val="32"/>
+          <w:szCs w:val="32"/>
+        </w:rPr>
+        <w:t>Lawyer</w:t>
+      </w:r>
+    </w:p>
+    <w:p>
+      <w:pPr>
+        <w:pStyle w:val="Header"/>
+        <w:pBdr>
+          <w:bottom w:val="thickThinSmallGap" w:sz="24" w:space="1" w:color="CC9900"/>
+        </w:pBdr>
+        <w:tabs>
+          <w:tab w:val="clear" w:pos="4680"/>
+        </w:tabs>
+        <w:spacing w:line="0" w:lineRule="atLeast"/>
+        <w:jc w:val="center"/>
+        <w:rPr>
+          <w:rFonts w:asciiTheme="majorBidi" w:hAnsiTheme="majorBidi" w:cstheme="majorBidi"/>
+          <w:b/>
+          <w:bCs/>
+          <w:color w:val="000000" w:themeColor="text1"/>
+          <w:sz w:val="32"/>
+          <w:szCs w:val="32"/>
+        </w:rPr>
+      </w:pPr>
+      <w:r>
+        <w:rPr>
+          <w:rFonts w:ascii="Vivaldi" w:hAnsi="Vivaldi" w:cstheme="majorBidi"/>
+          <w:b/>
+          <w:bCs/>
+          <w:color w:val="000000" w:themeColor="text1"/>
+          <w:sz w:val="32"/>
+          <w:szCs w:val="32"/>
+        </w:rPr>
+        <w:t>&amp;</w:t>
+      </w:r>
+      <w:r>
+        <w:rPr>
+          <w:rFonts w:ascii="Monotype Corsiva" w:hAnsi="Monotype Corsiva" w:cstheme="majorBidi"/>
+          <w:b/>
+          <w:bCs/>
+          <w:color w:val="000000" w:themeColor="text1"/>
+          <w:sz w:val="32"/>
+          <w:szCs w:val="32"/>
+        </w:rPr>
+        <w:t>P</w:t>
+      </w:r>
+      <w:r>
+        <w:rPr>
+          <w:rFonts w:ascii="Vivaldi" w:hAnsi="Vivaldi" w:cstheme="majorBidi"/>
+          <w:b/>
+          <w:bCs/>
+          <w:color w:val="000000" w:themeColor="text1"/>
+          <w:sz w:val="32"/>
+          <w:szCs w:val="32"/>
+        </w:rPr>
+        <w:t>artners</w:t>
+      </w:r>
+    </w:p>
+    <w:p>
+      <w:pPr>
+        <w:pStyle w:val="Header"/>
+        <w:pBdr>
+          <w:bottom w:val="thickThinSmallGap" w:sz="24" w:space="1" w:color="CC9900"/>
+        </w:pBdr>
+        <w:jc w:val="center"/>
+        <w:rPr>
+          <w:color w:val="CC9900"/>
+          <w:sz w:val="20"/>
+          <w:szCs w:val="20"/>
+          <w14:textOutline w14:w="9525" w14:cap="rnd" w14:cmpd="sng" w14:algn="ctr">
+            <w14:noFill/>
+            <w14:prstDash w14:val="solid"/>
+            <w14:bevel/>
+          </w14:textOutline>
+        </w:rPr>
+      </w:pPr>
+      <w:r>
+        <w:rPr>
+          <w:rFonts w:ascii="Microsoft Uighur" w:hAnsi="Microsoft Uighur" w:cs="Microsoft Uighur"/>
+          <w:b/>
+          <w:bCs/>
+          <w:color w:val="CC9900"/>
+          <w:sz w:val="24"/>
+          <w:szCs w:val="24"/>
+          <w14:textOutline w14:w="9525" w14:cap="rnd" w14:cmpd="sng" w14:algn="ctr">
+            <w14:noFill/>
+            <w14:prstDash w14:val="solid"/>
+            <w14:bevel/>
+          </w14:textOutline>
+        </w:rPr>
+        <w:t>IUS GENTIUM   IUSTITIA</w:t>
+      </w:r>
+    </w:p>
+    <w:p>
+      <w:pPr>
+        <w:jc w:val="center"/>
+        <w:rPr>
+          <w:rFonts w:ascii="Times New Roman" w:eastAsia="Calibri" w:hAnsi="Times New Roman" w:cs="Times New Roman"/>
+          <w:bCs/>
+          <w:sz w:val="24"/>
+          <w:szCs w:val="24"/>
+        </w:rPr>
+      </w:pPr>
+    </w:p>
+    <w:p>
+      <w:pPr>
+        <w:tabs>
+          <w:tab w:val="center" w:pos="4513"/>
+        </w:tabs>
         <w:sectPr>
-          <w:headerReference w:type="default" r:id="rId7"/>
-          <w:footerReference w:type="default" r:id="rId8"/>
-          <w:footerReference w:type="first" r:id="rId9"/>
+          <w:headerReference w:type="default" r:id="rId9"/>
+          <w:footerReference w:type="default" r:id="rId10"/>
+          <w:footerReference w:type="first" r:id="rId11"/>
           <w:pgSz w:w="11906" w:h="16838" w:code="9"/>
           <w:pgMar w:top="1440" w:right="1440" w:bottom="1276" w:left="1440" w:header="426" w:footer="399" w:gutter="0"/>
           <w:cols w:space="720"/>
           <w:docGrid w:linePitch="360"/>
         </w:sectPr>
       </w:pPr>
+      <w:r>
+        <w:tab/>
+      </w:r>
     </w:p>
     <w:p/>
     <w:sectPr>
-      <w:headerReference w:type="default" r:id="rId10"/>
+      <w:headerReference w:type="default" r:id="rId12"/>
       <w:pgSz w:w="11906" w:h="16838" w:code="9"/>
       <w:pgMar w:top="1440" w:right="1440" w:bottom="1276" w:left="1440" w:header="720" w:footer="399" w:gutter="0"/>
       <w:pgNumType w:start="2"/>
@@ -922,203 +1188,6 @@
   <w:p>
     <w:pPr>
       <w:pStyle w:val="Header"/>
-      <w:tabs>
-        <w:tab w:val="clear" w:pos="4680"/>
-      </w:tabs>
-      <w:spacing w:line="0" w:lineRule="atLeast"/>
-      <w:jc w:val="center"/>
-      <w:rPr>
-        <w:rFonts w:ascii="Vivaldi" w:hAnsi="Vivaldi" w:cstheme="majorBidi"/>
-        <w:b/>
-        <w:bCs/>
-        <w:color w:val="000000" w:themeColor="text1"/>
-        <w:sz w:val="32"/>
-        <w:szCs w:val="32"/>
-      </w:rPr>
-    </w:pPr>
-    <w:r>
-      <w:rPr>
-        <w:noProof/>
-        <w:color w:val="000000" w:themeColor="text1"/>
-        <w:sz w:val="24"/>
-        <w:szCs w:val="24"/>
-      </w:rPr>
-      <w:drawing>
-        <wp:anchor distT="0" distB="0" distL="114300" distR="114300" simplePos="0" relativeHeight="251659264" behindDoc="0" locked="0" layoutInCell="1" allowOverlap="1" wp14:anchorId="1B54FFF8" wp14:editId="26EC88AA">
-          <wp:simplePos x="0" y="0"/>
-          <wp:positionH relativeFrom="margin">
-            <wp:align>center</wp:align>
-          </wp:positionH>
-          <wp:positionV relativeFrom="paragraph">
-            <wp:posOffset>-190500</wp:posOffset>
-          </wp:positionV>
-          <wp:extent cx="1076325" cy="1030605"/>
-          <wp:effectExtent l="0" t="0" r="9525" b="0"/>
-          <wp:wrapTopAndBottom/>
-          <wp:docPr id="17" name="Picture 17"/>
-          <wp:cNvGraphicFramePr>
-            <a:graphicFrameLocks xmlns:a="http://schemas.openxmlformats.org/drawingml/2006/main" noChangeAspect="1"/>
-          </wp:cNvGraphicFramePr>
-          <a:graphic xmlns:a="http://schemas.openxmlformats.org/drawingml/2006/main">
-            <a:graphicData uri="http://schemas.openxmlformats.org/drawingml/2006/picture">
-              <pic:pic xmlns:pic="http://schemas.openxmlformats.org/drawingml/2006/picture">
-                <pic:nvPicPr>
-                  <pic:cNvPr id="1" name="Picture 1"/>
-                  <pic:cNvPicPr/>
-                </pic:nvPicPr>
-                <pic:blipFill rotWithShape="1">
-                  <a:blip r:embed="rId1">
-                    <a:clrChange>
-                      <a:clrFrom>
-                        <a:srgbClr val="341D1A"/>
-                      </a:clrFrom>
-                      <a:clrTo>
-                        <a:srgbClr val="341D1A">
-                          <a:alpha val="0"/>
-                        </a:srgbClr>
-                      </a:clrTo>
-                    </a:clrChange>
-                    <a:alphaModFix/>
-                    <a:extLst>
-                      <a:ext uri="{BEBA8EAE-BF5A-486C-A8C5-ECC9F3942E4B}">
-                        <a14:imgProps xmlns:a14="http://schemas.microsoft.com/office/drawing/2010/main">
-                          <a14:imgLayer r:embed="rId2">
-                            <a14:imgEffect>
-                              <a14:brightnessContrast bright="20000"/>
-                            </a14:imgEffect>
-                          </a14:imgLayer>
-                        </a14:imgProps>
-                      </a:ext>
-                      <a:ext uri="{28A0092B-C50C-407E-A947-70E740481C1C}">
-                        <a14:useLocalDpi xmlns:a14="http://schemas.microsoft.com/office/drawing/2010/main" val="0"/>
-                      </a:ext>
-                    </a:extLst>
-                  </a:blip>
-                  <a:srcRect l="23077" t="15064" r="27564" b="37660"/>
-                  <a:stretch/>
-                </pic:blipFill>
-                <pic:spPr bwMode="auto">
-                  <a:xfrm>
-                    <a:off x="0" y="0"/>
-                    <a:ext cx="1076325" cy="1030605"/>
-                  </a:xfrm>
-                  <a:prstGeom prst="rect">
-                    <a:avLst/>
-                  </a:prstGeom>
-                  <a:ln>
-                    <a:noFill/>
-                  </a:ln>
-                  <a:extLst>
-                    <a:ext uri="{53640926-AAD7-44D8-BBD7-CCE9431645EC}">
-                      <a14:shadowObscured xmlns:a14="http://schemas.microsoft.com/office/drawing/2010/main"/>
-                    </a:ext>
-                  </a:extLst>
-                </pic:spPr>
-              </pic:pic>
-            </a:graphicData>
-          </a:graphic>
-          <wp14:sizeRelH relativeFrom="margin">
-            <wp14:pctWidth>0</wp14:pctWidth>
-          </wp14:sizeRelH>
-          <wp14:sizeRelV relativeFrom="margin">
-            <wp14:pctHeight>0</wp14:pctHeight>
-          </wp14:sizeRelV>
-        </wp:anchor>
-      </w:drawing>
-    </w:r>
-    <w:proofErr w:type="spellStart"/>
-    <w:r>
-      <w:rPr>
-        <w:rFonts w:ascii="Vivaldi" w:hAnsi="Vivaldi" w:cstheme="majorBidi"/>
-        <w:b/>
-        <w:bCs/>
-        <w:color w:val="000000" w:themeColor="text1"/>
-        <w:sz w:val="32"/>
-        <w:szCs w:val="32"/>
-      </w:rPr>
-      <w:t>Mif</w:t>
-    </w:r>
-    <w:proofErr w:type="spellEnd"/>
-    <w:r>
-      <w:rPr>
-        <w:rFonts w:asciiTheme="majorBidi" w:hAnsiTheme="majorBidi" w:cstheme="majorBidi"/>
-        <w:b/>
-        <w:bCs/>
-        <w:color w:val="000000" w:themeColor="text1"/>
-        <w:sz w:val="32"/>
-        <w:szCs w:val="32"/>
-      </w:rPr>
-      <w:t xml:space="preserve"> </w:t>
-    </w:r>
-    <w:r>
-      <w:rPr>
-        <w:rFonts w:ascii="Vivaldi" w:hAnsi="Vivaldi" w:cstheme="majorBidi"/>
-        <w:b/>
-        <w:bCs/>
-        <w:color w:val="000000" w:themeColor="text1"/>
-        <w:sz w:val="32"/>
-        <w:szCs w:val="32"/>
-      </w:rPr>
-      <w:t>Lawyer</w:t>
-    </w:r>
-  </w:p>
-  <w:p>
-    <w:pPr>
-      <w:pStyle w:val="Header"/>
-      <w:pBdr>
-        <w:bottom w:val="thickThinSmallGap" w:sz="24" w:space="1" w:color="CC9900"/>
-      </w:pBdr>
-      <w:tabs>
-        <w:tab w:val="clear" w:pos="4680"/>
-      </w:tabs>
-      <w:spacing w:line="0" w:lineRule="atLeast"/>
-      <w:jc w:val="center"/>
-      <w:rPr>
-        <w:rFonts w:asciiTheme="majorBidi" w:hAnsiTheme="majorBidi" w:cstheme="majorBidi"/>
-        <w:b/>
-        <w:bCs/>
-        <w:color w:val="000000" w:themeColor="text1"/>
-        <w:sz w:val="32"/>
-        <w:szCs w:val="32"/>
-      </w:rPr>
-    </w:pPr>
-    <w:r>
-      <w:rPr>
-        <w:rFonts w:ascii="Vivaldi" w:hAnsi="Vivaldi" w:cstheme="majorBidi"/>
-        <w:b/>
-        <w:bCs/>
-        <w:color w:val="000000" w:themeColor="text1"/>
-        <w:sz w:val="32"/>
-        <w:szCs w:val="32"/>
-      </w:rPr>
-      <w:t>&amp;</w:t>
-    </w:r>
-    <w:r>
-      <w:rPr>
-        <w:rFonts w:ascii="Monotype Corsiva" w:hAnsi="Monotype Corsiva" w:cstheme="majorBidi"/>
-        <w:b/>
-        <w:bCs/>
-        <w:color w:val="000000" w:themeColor="text1"/>
-        <w:sz w:val="32"/>
-        <w:szCs w:val="32"/>
-      </w:rPr>
-      <w:t>P</w:t>
-    </w:r>
-    <w:r>
-      <w:rPr>
-        <w:rFonts w:ascii="Vivaldi" w:hAnsi="Vivaldi" w:cstheme="majorBidi"/>
-        <w:b/>
-        <w:bCs/>
-        <w:color w:val="000000" w:themeColor="text1"/>
-        <w:sz w:val="32"/>
-        <w:szCs w:val="32"/>
-      </w:rPr>
-      <w:t>artners</w:t>
-    </w:r>
-  </w:p>
-  <w:p>
-    <w:pPr>
-      <w:pStyle w:val="Header"/>
       <w:pBdr>
         <w:bottom w:val="thickThinSmallGap" w:sz="24" w:space="1" w:color="CC9900"/>
       </w:pBdr>
@@ -1134,22 +1203,6 @@
         </w14:textOutline>
       </w:rPr>
     </w:pPr>
-    <w:r>
-      <w:rPr>
-        <w:rFonts w:ascii="Microsoft Uighur" w:hAnsi="Microsoft Uighur" w:cs="Microsoft Uighur"/>
-        <w:b/>
-        <w:bCs/>
-        <w:color w:val="CC9900"/>
-        <w:sz w:val="24"/>
-        <w:szCs w:val="24"/>
-        <w14:textOutline w14:w="9525" w14:cap="rnd" w14:cmpd="sng" w14:algn="ctr">
-          <w14:noFill/>
-          <w14:prstDash w14:val="solid"/>
-          <w14:bevel/>
-        </w14:textOutline>
-      </w:rPr>
-      <w:t>IUS GENTIUM   IUSTITIA</w:t>
-    </w:r>
   </w:p>
 </w:hdr>
 </file>

</xml_diff>